<commit_message>
Meijer singles add-on: skeptic corrections applied (grocer benchmark excludes Meijer, Walmart share, High scenario relabeled with all-store cross-check, test sized from Meijer store data, fixed 4-pack lineup) [no-findings-change]
Co-Authored-By: Claude Opus 5.5 (1M context) <noreply@anthropic.com>
</commit_message>
<xml_diff>
--- a/docs/briefs/meijer_v2/Meijer_Singles_Addendum_2026-10-13.docx
+++ b/docs/briefs/meijer_v2/Meijer_Singles_Addendum_2026-10-13.docx
@@ -62,7 +62,7 @@
         <w:pStyle w:val="ListBullet"/>
       </w:pPr>
       <w:r>
-        <w:t>Meijer is the only grocery account that carries BUILT 4-packs but no singles. Every other grocer started with singles. The only retailers that added singles to an established 4-pack set are Target and Walmart, both supercenters like Meijer.</w:t>
+        <w:t>Meijer is the only grocery account that sells BUILT 4-packs with essentially no singles (one single in one store in the last two weeks of data). Every other grocer started with singles. The only retailers that added singles to an established 4-pack set are Target and Walmart, both supercenters like Meijer.</w:t>
       </w:r>
     </w:p>
     <w:p>
@@ -86,7 +86,7 @@
         <w:pStyle w:val="ListBullet"/>
       </w:pPr>
       <w:r>
-        <w:t>A typical grocer sells about 3.4 singles per item per store per week, a typical convenience chain about 2.0 (Wawa 4.5), and Target about 5 with singles in most stores. Singles sell for about 13% more per bar than 4-packs.</w:t>
+        <w:t>A typical grocer sells about 3.3 singles per item per store per week, a typical convenience chain about 2.0 (Wawa 4.5), and Target about 4.8 with singles in most stores. Singles sell for about 13% more per bar than 4-packs.</w:t>
       </w:r>
     </w:p>
     <w:p>
@@ -94,7 +94,7 @@
         <w:pStyle w:val="ListBullet"/>
       </w:pPr>
       <w:r>
-        <w:t>At Meijer, 4 checkout singles in all stores could sell roughly 2,240–5,376 bars a week (scenarios below). Even if close to half came out of 4-packs, BUILT would gain bars and dollars. This is a scenario, not a forecast.</w:t>
+        <w:t>At Meijer, 4 checkout singles in all stores could sell roughly 2,200–5,400 bars a week (scenarios below). In these scenarios, even if close to half came out of 4-packs, BUILT would gain bars and dollars. This is a scenario, not a forecast.</w:t>
       </w:r>
     </w:p>
     <w:p>
@@ -186,7 +186,7 @@
         <w:pStyle w:val="ListBullet"/>
       </w:pPr>
       <w:r>
-        <w:t>Target: singles in about 10% of stores in early October 2025, about 70% on average in November–December (53–83% week to week, including a holiday flavor), back to about 16% from January to May, then 82–91% from June to September 2026.</w:t>
+        <w:t>Target: singles in about 10% of stores in early October 2025, about 70% on average in November–December (53–83% week to week, including a holiday flavor), back to about 16% from February to May, then 82–91% from June to September 2026.</w:t>
       </w:r>
     </w:p>
     <w:p>
@@ -194,7 +194,7 @@
         <w:pStyle w:val="ListBullet"/>
       </w:pPr>
       <w:r>
-        <w:t>Walmart: about 40% of stores in January–March 2026, fading gradually (26% in April, 9% in July), then about 37% again in August–September.</w:t>
+        <w:t>Walmart: about 40% of stores in February–March 2026, fading gradually (26% in April, 9% in July), then about 37% again in August–September.</w:t>
       </w:r>
     </w:p>
     <w:p>
@@ -532,7 +532,7 @@
               <w:rPr>
                 <w:sz w:val="18"/>
               </w:rPr>
-              <w:t>Typical grocer (middle of 16 grocery accounts)</w:t>
+              <w:t>Typical grocer (middle of 15 grocery accounts)</w:t>
             </w:r>
           </w:p>
         </w:tc>
@@ -546,7 +546,7 @@
               <w:rPr>
                 <w:sz w:val="18"/>
               </w:rPr>
-              <w:t>3.4</w:t>
+              <w:t>3.3</w:t>
             </w:r>
           </w:p>
         </w:tc>
@@ -668,7 +668,7 @@
               <w:rPr>
                 <w:sz w:val="18"/>
               </w:rPr>
-              <w:t>Walmart (about a third of stores)</w:t>
+              <w:t>Walmart (about one store in five on average, 9–37%)</w:t>
             </w:r>
           </w:p>
         </w:tc>
@@ -1080,7 +1080,7 @@
           <w:color w:val="7D879C"/>
           <w:sz w:val="16"/>
         </w:rPr>
-        <w:t>Convenience stores are the closest SPINS view of impulse buying. Cookie Dough, Brownie Batter and Coconut, three of Meijer's main 4-pack flavors, lead. At Target, Peanut Butter and Brownie Batter rank highest, but items in fewer stores show higher sales per store, so that ranking is not like-for-like.</w:t>
+        <w:t>Convenience stores are the closest SPINS view of impulse buying. Cookie Dough Chunk and Brownie Batter lead, with Coconut close behind; all three are main Meijer 4-pack flavors. Salted Caramel ranks third but only 3 chains sell it, and the gaps are small. At Target, Peanut Butter and Brownie Batter rank highest, but items in fewer stores show higher sales per store, so that ranking is not an apples-to-apples comparison.</w:t>
       </w:r>
     </w:p>
     <w:p>
@@ -1340,7 +1340,7 @@
         <w:keepNext/>
       </w:pPr>
       <w:r>
-        <w:t>Assumptions: 4 singles at checkout in all 280 Meijer stores; sales per store from section 4; a single at about $2.52; Meijer's 4-pack bars at about $2.28 each; Meijer's 4-packs now sell about 69 bars per store per week. The share taken from 4-packs spans the range seen at Target.</w:t>
+        <w:t>Assumptions: 4 singles at checkout in all 280 Meijer stores; sales per store from section 4; a single at about $2.52; Meijer's 4-pack bars at about $2.28 each; Meijer's 4-packs now sell about 69 bars per store per week. The share taken from 4-packs covers the range seen at Target (none to just under half). Sales rates come from stores that sold each item that week, often a retailer's stronger stores; applying them to all 4 items in all 280 stores every week is an upper reading. For comparison, across all its stores Target sells about 17 singles bars per store per week from 13 items, and Walmart about 8 from 16.</w:t>
       </w:r>
     </w:p>
     <w:tbl>
@@ -1526,7 +1526,7 @@
               <w:rPr>
                 <w:sz w:val="16"/>
               </w:rPr>
-              <w:t>2,240</w:t>
+              <w:t>2,237</w:t>
             </w:r>
           </w:p>
         </w:tc>
@@ -1540,7 +1540,7 @@
               <w:rPr>
                 <w:sz w:val="16"/>
               </w:rPr>
-              <w:t>$5,644</w:t>
+              <w:t>$5,637</w:t>
             </w:r>
           </w:p>
         </w:tc>
@@ -1554,7 +1554,7 @@
               <w:rPr>
                 <w:sz w:val="16"/>
               </w:rPr>
-              <w:t>2,240</w:t>
+              <w:t>2,237</w:t>
             </w:r>
           </w:p>
         </w:tc>
@@ -1568,7 +1568,7 @@
               <w:rPr>
                 <w:sz w:val="16"/>
               </w:rPr>
-              <w:t>$5,644</w:t>
+              <w:t>$5,637</w:t>
             </w:r>
           </w:p>
         </w:tc>
@@ -1632,7 +1632,7 @@
               <w:rPr>
                 <w:sz w:val="16"/>
               </w:rPr>
-              <w:t>2,240</w:t>
+              <w:t>2,237</w:t>
             </w:r>
           </w:p>
         </w:tc>
@@ -1647,7 +1647,7 @@
               <w:rPr>
                 <w:sz w:val="16"/>
               </w:rPr>
-              <w:t>$5,644</w:t>
+              <w:t>$5,637</w:t>
             </w:r>
           </w:p>
         </w:tc>
@@ -1662,7 +1662,7 @@
               <w:rPr>
                 <w:sz w:val="16"/>
               </w:rPr>
-              <w:t>1,680</w:t>
+              <w:t>1,678</w:t>
             </w:r>
           </w:p>
         </w:tc>
@@ -1677,7 +1677,7 @@
               <w:rPr>
                 <w:sz w:val="16"/>
               </w:rPr>
-              <w:t>$4,365</w:t>
+              <w:t>$4,359</w:t>
             </w:r>
           </w:p>
         </w:tc>
@@ -1739,7 +1739,7 @@
               <w:rPr>
                 <w:sz w:val="16"/>
               </w:rPr>
-              <w:t>2,240</w:t>
+              <w:t>2,237</w:t>
             </w:r>
           </w:p>
         </w:tc>
@@ -1753,7 +1753,7 @@
               <w:rPr>
                 <w:sz w:val="16"/>
               </w:rPr>
-              <w:t>$5,644</w:t>
+              <w:t>$5,637</w:t>
             </w:r>
           </w:p>
         </w:tc>
@@ -1767,7 +1767,7 @@
               <w:rPr>
                 <w:sz w:val="16"/>
               </w:rPr>
-              <w:t>1,232</w:t>
+              <w:t>1,230</w:t>
             </w:r>
           </w:p>
         </w:tc>
@@ -1781,7 +1781,7 @@
               <w:rPr>
                 <w:sz w:val="16"/>
               </w:rPr>
-              <w:t>$3,341</w:t>
+              <w:t>$3,337</w:t>
             </w:r>
           </w:p>
         </w:tc>
@@ -1845,7 +1845,7 @@
               <w:rPr>
                 <w:sz w:val="16"/>
               </w:rPr>
-              <w:t>3,752</w:t>
+              <w:t>3,702</w:t>
             </w:r>
           </w:p>
         </w:tc>
@@ -1860,7 +1860,7 @@
               <w:rPr>
                 <w:sz w:val="16"/>
               </w:rPr>
-              <w:t>$9,455</w:t>
+              <w:t>$9,328</w:t>
             </w:r>
           </w:p>
         </w:tc>
@@ -1875,7 +1875,7 @@
               <w:rPr>
                 <w:sz w:val="16"/>
               </w:rPr>
-              <w:t>3,752</w:t>
+              <w:t>3,702</w:t>
             </w:r>
           </w:p>
         </w:tc>
@@ -1890,7 +1890,7 @@
               <w:rPr>
                 <w:sz w:val="16"/>
               </w:rPr>
-              <w:t>$9,455</w:t>
+              <w:t>$9,328</w:t>
             </w:r>
           </w:p>
         </w:tc>
@@ -1952,7 +1952,7 @@
               <w:rPr>
                 <w:sz w:val="16"/>
               </w:rPr>
-              <w:t>3,752</w:t>
+              <w:t>3,702</w:t>
             </w:r>
           </w:p>
         </w:tc>
@@ -1966,7 +1966,7 @@
               <w:rPr>
                 <w:sz w:val="16"/>
               </w:rPr>
-              <w:t>$9,455</w:t>
+              <w:t>$9,328</w:t>
             </w:r>
           </w:p>
         </w:tc>
@@ -1980,7 +1980,7 @@
               <w:rPr>
                 <w:sz w:val="16"/>
               </w:rPr>
-              <w:t>2,814</w:t>
+              <w:t>2,776</w:t>
             </w:r>
           </w:p>
         </w:tc>
@@ -1994,7 +1994,7 @@
               <w:rPr>
                 <w:sz w:val="16"/>
               </w:rPr>
-              <w:t>$7,311</w:t>
+              <w:t>$7,214</w:t>
             </w:r>
           </w:p>
         </w:tc>
@@ -2008,7 +2008,7 @@
               <w:rPr>
                 <w:sz w:val="16"/>
               </w:rPr>
-              <w:t>+15%</w:t>
+              <w:t>+14%</w:t>
             </w:r>
           </w:p>
         </w:tc>
@@ -2058,7 +2058,7 @@
               <w:rPr>
                 <w:sz w:val="16"/>
               </w:rPr>
-              <w:t>3,752</w:t>
+              <w:t>3,702</w:t>
             </w:r>
           </w:p>
         </w:tc>
@@ -2073,7 +2073,7 @@
               <w:rPr>
                 <w:sz w:val="16"/>
               </w:rPr>
-              <w:t>$9,455</w:t>
+              <w:t>$9,328</w:t>
             </w:r>
           </w:p>
         </w:tc>
@@ -2088,7 +2088,7 @@
               <w:rPr>
                 <w:sz w:val="16"/>
               </w:rPr>
-              <w:t>2,064</w:t>
+              <w:t>2,036</w:t>
             </w:r>
           </w:p>
         </w:tc>
@@ -2103,7 +2103,7 @@
               <w:rPr>
                 <w:sz w:val="16"/>
               </w:rPr>
-              <w:t>$5,597</w:t>
+              <w:t>$5,522</w:t>
             </w:r>
           </w:p>
         </w:tc>
@@ -2137,7 +2137,7 @@
               <w:rPr>
                 <w:sz w:val="16"/>
               </w:rPr>
-              <w:t>High (Target, singles in most stores)</w:t>
+              <w:t>High (Target's rate, applied to every store)</w:t>
             </w:r>
           </w:p>
         </w:tc>
@@ -2165,7 +2165,7 @@
               <w:rPr>
                 <w:sz w:val="16"/>
               </w:rPr>
-              <w:t>5,376</w:t>
+              <w:t>5,356</w:t>
             </w:r>
           </w:p>
         </w:tc>
@@ -2179,7 +2179,7 @@
               <w:rPr>
                 <w:sz w:val="16"/>
               </w:rPr>
-              <w:t>$13,547</w:t>
+              <w:t>$13,496</w:t>
             </w:r>
           </w:p>
         </w:tc>
@@ -2193,7 +2193,7 @@
               <w:rPr>
                 <w:sz w:val="16"/>
               </w:rPr>
-              <w:t>5,376</w:t>
+              <w:t>5,356</w:t>
             </w:r>
           </w:p>
         </w:tc>
@@ -2207,7 +2207,7 @@
               <w:rPr>
                 <w:sz w:val="16"/>
               </w:rPr>
-              <w:t>$13,547</w:t>
+              <w:t>$13,496</w:t>
             </w:r>
           </w:p>
         </w:tc>
@@ -2241,7 +2241,7 @@
               <w:rPr>
                 <w:sz w:val="16"/>
               </w:rPr>
-              <w:t>High (Target, singles in most stores)</w:t>
+              <w:t>High (Target's rate, applied to every store)</w:t>
             </w:r>
           </w:p>
         </w:tc>
@@ -2271,7 +2271,7 @@
               <w:rPr>
                 <w:sz w:val="16"/>
               </w:rPr>
-              <w:t>5,376</w:t>
+              <w:t>5,356</w:t>
             </w:r>
           </w:p>
         </w:tc>
@@ -2286,7 +2286,7 @@
               <w:rPr>
                 <w:sz w:val="16"/>
               </w:rPr>
-              <w:t>$13,547</w:t>
+              <w:t>$13,496</w:t>
             </w:r>
           </w:p>
         </w:tc>
@@ -2301,7 +2301,7 @@
               <w:rPr>
                 <w:sz w:val="16"/>
               </w:rPr>
-              <w:t>4,032</w:t>
+              <w:t>4,017</w:t>
             </w:r>
           </w:p>
         </w:tc>
@@ -2316,7 +2316,7 @@
               <w:rPr>
                 <w:sz w:val="16"/>
               </w:rPr>
-              <w:t>$10,476</w:t>
+              <w:t>$10,437</w:t>
             </w:r>
           </w:p>
         </w:tc>
@@ -2350,7 +2350,7 @@
               <w:rPr>
                 <w:sz w:val="16"/>
               </w:rPr>
-              <w:t>High (Target, singles in most stores)</w:t>
+              <w:t>High (Target's rate, applied to every store)</w:t>
             </w:r>
           </w:p>
         </w:tc>
@@ -2378,7 +2378,7 @@
               <w:rPr>
                 <w:sz w:val="16"/>
               </w:rPr>
-              <w:t>5,376</w:t>
+              <w:t>5,356</w:t>
             </w:r>
           </w:p>
         </w:tc>
@@ -2392,7 +2392,7 @@
               <w:rPr>
                 <w:sz w:val="16"/>
               </w:rPr>
-              <w:t>$13,547</w:t>
+              <w:t>$13,496</w:t>
             </w:r>
           </w:p>
         </w:tc>
@@ -2406,7 +2406,7 @@
               <w:rPr>
                 <w:sz w:val="16"/>
               </w:rPr>
-              <w:t>2,957</w:t>
+              <w:t>2,946</w:t>
             </w:r>
           </w:p>
         </w:tc>
@@ -2420,7 +2420,7 @@
               <w:rPr>
                 <w:sz w:val="16"/>
               </w:rPr>
-              <w:t>$8,019</w:t>
+              <w:t>$7,989</w:t>
             </w:r>
           </w:p>
         </w:tc>
@@ -2447,7 +2447,7 @@
           <w:color w:val="7D879C"/>
           <w:sz w:val="16"/>
         </w:rPr>
-        <w:t>Retail dollars at shelf price, before Meijer's margin; BUILT's revenue is its selling price to Meijer. Estimates from other retailers' patterns; checkout placement may sell differently from where singles sit at those retailers.</w:t>
+        <w:t>Retail dollars at shelf price, before Meijer's margin; BUILT's revenue is its selling price to Meijer. Estimates from other retailers' patterns; checkout placement may sell differently from where singles sit at those retailers. Before checkout placement fees and BUILT's cost per single bar.</w:t>
       </w:r>
     </w:p>
     <w:p>
@@ -2469,7 +2469,15 @@
         <w:pStyle w:val="ListBullet"/>
       </w:pPr>
       <w:r>
-        <w:t>Put 3–4 singles at the checkouts in a set of test stores (for example 40–60), and pick matched control stores with similar BUILT 4-pack sales and region.</w:t>
+        <w:t>Put 3–4 singles at the checkouts in a set of test stores (the number to be set from Meijer's store-level sales so the test can detect a 5–10% change in 4-pack sales), and pick matched control stores with similar BUILT 4-pack sales and region.</w:t>
+      </w:r>
+    </w:p>
+    <w:p>
+      <w:pPr>
+        <w:pStyle w:val="ListBullet"/>
+      </w:pPr>
+      <w:r>
+        <w:t>Keep the 4-pack lineup and promotions the same in test and control stores; new flavors are why Target's result is uncertain. Compare with at least 13 weeks before the test.</w:t>
       </w:r>
     </w:p>
     <w:p>
@@ -2485,7 +2493,7 @@
         <w:pStyle w:val="ListBullet"/>
       </w:pPr>
       <w:r>
-        <w:t>Measure, test vs control: BUILT 4-pack base units per store per week (did 4-packs lose?), singles sold per store per week, and total BUILT bars and dollars per store.</w:t>
+        <w:t>Measure, test vs control: BUILT 4-pack non-promoted units per store per week (did 4-packs lose?), singles sold per store per week, and total BUILT bars and dollars per store.</w:t>
       </w:r>
     </w:p>
     <w:p>

</xml_diff>